<commit_message>
change brian's affiliation and rerender
</commit_message>
<xml_diff>
--- a/docs/manuscript/paper_revisions1.docx
+++ b/docs/manuscript/paper_revisions1.docx
@@ -22,7 +22,7 @@
         <w:rPr>
           <w:vertAlign w:val="superscript"/>
         </w:rPr>
-        <w:t xml:space="preserve">1,3</w:t>
+        <w:t xml:space="preserve">1,4</w:t>
       </w:r>
       <w:r>
         <w:t xml:space="preserve">, Brian C. Leavell</w:t>
@@ -31,16 +31,58 @@
         <w:rPr>
           <w:vertAlign w:val="superscript"/>
         </w:rPr>
+        <w:t xml:space="preserve">2,3</w:t>
+      </w:r>
+      <w:r>
+        <w:t xml:space="preserve">, Bryan M. Maitland</w:t>
+      </w:r>
+      <w:r>
+        <w:rPr>
+          <w:vertAlign w:val="superscript"/>
+        </w:rPr>
+        <w:t xml:space="preserve">1</w:t>
+      </w:r>
+    </w:p>
+    <w:p>
+      <w:pPr>
+        <w:pStyle w:val="BodyText"/>
+      </w:pPr>
+      <w:r>
+        <w:rPr>
+          <w:vertAlign w:val="superscript"/>
+        </w:rPr>
+        <w:t xml:space="preserve">1</w:t>
+      </w:r>
+      <w:r>
+        <w:t xml:space="preserve">Rocky Mountain Research Station, U.S. Forest Service, Boise, Idaho, USA</w:t>
+      </w:r>
+    </w:p>
+    <w:p>
+      <w:pPr>
+        <w:pStyle w:val="BodyText"/>
+      </w:pPr>
+      <w:r>
+        <w:rPr>
+          <w:vertAlign w:val="superscript"/>
+        </w:rPr>
         <w:t xml:space="preserve">2</w:t>
       </w:r>
       <w:r>
-        <w:t xml:space="preserve">, Bryan M. Maitland</w:t>
-      </w:r>
+        <w:t xml:space="preserve">Smithsonian Tropical Research Institute, Balboa, Ancón, Panamá</w:t>
+      </w:r>
+    </w:p>
+    <w:p>
+      <w:pPr>
+        <w:pStyle w:val="BodyText"/>
+      </w:pPr>
       <w:r>
         <w:rPr>
           <w:vertAlign w:val="superscript"/>
         </w:rPr>
-        <w:t xml:space="preserve">1</w:t>
+        <w:t xml:space="preserve">3</w:t>
+      </w:r>
+      <w:r>
+        <w:t xml:space="preserve">Department of Biological Sciences, Purdue University, West Lafayette, IN, USA</w:t>
       </w:r>
     </w:p>
     <w:p>
@@ -51,35 +93,7 @@
         <w:rPr>
           <w:vertAlign w:val="superscript"/>
         </w:rPr>
-        <w:t xml:space="preserve">1</w:t>
-      </w:r>
-      <w:r>
-        <w:t xml:space="preserve">Rocky Mountain Research Station, U.S. Forest Service, Boise, Idaho, USA</w:t>
-      </w:r>
-    </w:p>
-    <w:p>
-      <w:pPr>
-        <w:pStyle w:val="BodyText"/>
-      </w:pPr>
-      <w:r>
-        <w:rPr>
-          <w:vertAlign w:val="superscript"/>
-        </w:rPr>
-        <w:t xml:space="preserve">2</w:t>
-      </w:r>
-      <w:r>
-        <w:t xml:space="preserve">Smithsonian Tropical Research Institute, Balboa, Ancón, Panamá</w:t>
-      </w:r>
-    </w:p>
-    <w:p>
-      <w:pPr>
-        <w:pStyle w:val="BodyText"/>
-      </w:pPr>
-      <w:r>
-        <w:rPr>
-          <w:vertAlign w:val="superscript"/>
-        </w:rPr>
-        <w:t xml:space="preserve">3</w:t>
+        <w:t xml:space="preserve">4</w:t>
       </w:r>
       <w:r>
         <w:t xml:space="preserve">Corresponding author,</w:t>

</xml_diff>